<commit_message>
Admitting a new admin requires two approvers
Pending accounts get an Admit button on the Database page. It opens an
ADMIT_ADMIN quorum ticket; the account is promoted only when a second,
different approver co-signs. Self-admission, self-approval and duplicate
requests are refused and audited.

Co-Authored-By: Claude Opus 5.5 <noreply@anthropic.com>
</commit_message>
<xml_diff>
--- a/summary.docx
+++ b/summary.docx
@@ -225,7 +225,7 @@
         <w:spacing w:after="120"/>
       </w:pPr>
       <w:r>
-        <w:t xml:space="preserve">New admins who sign up later start as “pending”: they cannot see data, approve requests or open the database. This stops anyone creating a sock-puppet second approver.</w:t>
+        <w:t xml:space="preserve">New admins who sign up later start as “pending”: they cannot see data, approve requests or open the database. Admitting them is itself a quorum action: one approver requests the admission and a second, different approver must co-sign before the account becomes an approver. This stops anyone creating a sock-puppet second approver.</w:t>
       </w:r>
     </w:p>
     <w:p>
@@ -566,6 +566,74 @@
                 <w:szCs w:val="20"/>
               </w:rPr>
               <w:t xml:space="preserve">Enforced on the server, not in the browser.</w:t>
+            </w:r>
+          </w:p>
+        </w:tc>
+      </w:tr>
+      <w:tr>
+        <w:tc>
+          <w:tcPr>
+            <w:tcW w:type="dxa" w:w="3000"/>
+            <w:tcMar>
+              <w:top w:type="dxa" w:w="80"/>
+              <w:left w:type="dxa" w:w="120"/>
+              <w:bottom w:type="dxa" w:w="80"/>
+              <w:right w:type="dxa" w:w="120"/>
+            </w:tcMar>
+          </w:tcPr>
+          <w:p>
+            <w:r>
+              <w:rPr>
+                <w:b w:val="false"/>
+                <w:bCs w:val="false"/>
+                <w:sz w:val="20"/>
+                <w:szCs w:val="20"/>
+              </w:rPr>
+              <w:t xml:space="preserve">Admitting a new admin needs two approvers</w:t>
+            </w:r>
+          </w:p>
+        </w:tc>
+        <w:tc>
+          <w:tcPr>
+            <w:tcW w:type="dxa" w:w="1700"/>
+            <w:tcMar>
+              <w:top w:type="dxa" w:w="80"/>
+              <w:left w:type="dxa" w:w="120"/>
+              <w:bottom w:type="dxa" w:w="80"/>
+              <w:right w:type="dxa" w:w="120"/>
+            </w:tcMar>
+          </w:tcPr>
+          <w:p>
+            <w:r>
+              <w:rPr>
+                <w:b w:val="false"/>
+                <w:bCs w:val="false"/>
+                <w:sz w:val="20"/>
+                <w:szCs w:val="20"/>
+              </w:rPr>
+              <w:t xml:space="preserve">Real</w:t>
+            </w:r>
+          </w:p>
+        </w:tc>
+        <w:tc>
+          <w:tcPr>
+            <w:tcW w:type="dxa" w:w="4326"/>
+            <w:tcMar>
+              <w:top w:type="dxa" w:w="80"/>
+              <w:left w:type="dxa" w:w="120"/>
+              <w:bottom w:type="dxa" w:w="80"/>
+              <w:right w:type="dxa" w:w="120"/>
+            </w:tcMar>
+          </w:tcPr>
+          <w:p>
+            <w:r>
+              <w:rPr>
+                <w:b w:val="false"/>
+                <w:bCs w:val="false"/>
+                <w:sz w:val="20"/>
+                <w:szCs w:val="20"/>
+              </w:rPr>
+              <w:t xml:space="preserve">Pending account is promoted only when a second approver co-signs.</w:t>
             </w:r>
           </w:p>
         </w:tc>

</xml_diff>